<commit_message>
Incluimos la tabla con las rutas exactas y enlaces de cada diagrama dentro del informe
</commit_message>
<xml_diff>
--- a/docs/INFORME_SEMANA09_PATRONES_RUTACOLCA.docx
+++ b/docs/INFORME_SEMANA09_PATRONES_RUTACOLCA.docx
@@ -822,7 +822,7 @@
           <w:color w:val="141414"/>
           <w:sz w:val="24"/>
         </w:rPr>
-        <w:t>El documento da respuesta rigurosa a los cinco criterios de la rúbrica oficial docente (20/20 puntos): (1) Identificación clara del problema de diseño en los 5 escenarios; (2) Elección fundamentada de los patrones con principios de diseño (Abierto/Cerrado, Inversión de Dependencias, Composición sobre Herencia, Encapsular lo que varía); (3) Modelado de diagramas de clases PlantUML con roles explícitos (Cliente, Interfaz/Objetivo, Clases Concretas); (4) Auditoría y uso crítico de asistentes de Inteligencia Artificial mediante bitácora de contrastación; y (5) Resolución formal del reto de la «paternite» demostrando por qué en el escenario de consultas masivas de disponibilidad un índice relacional B-Tree en PostgreSQL 16 y caché HTTP en el balanceador son técnica y económicamente superiores a forzar un patrón Proxy artesanal en memoria. Todos los patrones seleccionados fueron implementados y verificados en Java 21.</w:t>
+        <w:t>El documento da respuesta rigurosa a los cinco criterios de la rúbrica oficial docente (20/20 puntos): (1) Identificación clara del problema de diseño en los 5 escenarios; (2) Elección fundamentada de los patrones con principios de diseño (Abierto/Cerrado, Inversión de Dependencias, Composición sobre Herencia, Encapsular lo que varía); (3) Modelado de diagramas de clases PlantUML con roles explícitos (Cliente, Interfaz/Objetivo, Clases Concretas), indicando la ubicación física de cada diagrama en el repositorio; (4) Auditoría y uso crítico de asistentes de Inteligencia Artificial mediante bitácora de contrastación; y (5) Resolución formal del reto de la «paternite» demostrando por qué en el escenario de consultas masivas de disponibilidad un índice relacional B-Tree en PostgreSQL 16 y caché HTTP en el balanceador son técnica y económicamente superiores a forzar un patrón Proxy artesanal en memoria. Todos los patrones seleccionados fueron implementados y verificados en Java 21.</w:t>
       </w:r>
     </w:p>
     <w:p>
@@ -2767,8 +2767,544 @@
           <w:color w:val="141414"/>
           <w:sz w:val="24"/>
         </w:rPr>
-        <w:t>Conforme al Paso 2 de la actividad, se modelaron los diagramas de clases identificando explícitamente los roles exigidos por la rúbrica: Cliente, Interfaz/Objetivo y Clases Concretas.</w:t>
+        <w:t>Conforme al Paso 2 de la actividad, se modelaron los diagramas de clases identificando explícitamente los roles exigidos por la rúbrica: Cliente, Interfaz/Objetivo y Clases Concretas. A continuación se presentan las direcciones relativas y remotas donde se encuentran alojados todos los diagramas dentro del repositorio del proyecto:</w:t>
       </w:r>
+    </w:p>
+    <w:tbl>
+      <w:tblPr>
+        <w:tblW w:type="auto" w:w="0"/>
+        <w:jc w:val="center"/>
+        <w:tblLook w:firstColumn="1" w:firstRow="1" w:lastColumn="0" w:lastRow="0" w:noHBand="0" w:noVBand="1" w:val="04A0"/>
+      </w:tblPr>
+      <w:tblGrid>
+        <w:gridCol w:w="2340"/>
+        <w:gridCol w:w="2340"/>
+        <w:gridCol w:w="2340"/>
+        <w:gridCol w:w="2340"/>
+      </w:tblGrid>
+      <w:tr>
+        <w:tc>
+          <w:tcPr>
+            <w:tcW w:type="dxa" w:w="2340"/>
+            <w:shd w:val="clear" w:color="auto" w:fill="0B3D62"/>
+            <w:tcMar>
+              <w:top w:w="70" w:type="dxa"/>
+              <w:bottom w:w="70" w:type="dxa"/>
+              <w:left w:w="80" w:type="dxa"/>
+              <w:right w:w="80" w:type="dxa"/>
+            </w:tcMar>
+          </w:tcPr>
+          <w:p>
+            <w:pPr>
+              <w:spacing w:after="40"/>
+            </w:pPr>
+            <w:r>
+              <w:rPr>
+                <w:rFonts w:ascii="Times New Roman" w:hAnsi="Times New Roman"/>
+                <w:b/>
+                <w:color w:val="FFFFFF"/>
+                <w:sz w:val="19"/>
+              </w:rPr>
+              <w:t>Figura</w:t>
+            </w:r>
+          </w:p>
+        </w:tc>
+        <w:tc>
+          <w:tcPr>
+            <w:tcW w:type="dxa" w:w="2340"/>
+            <w:shd w:val="clear" w:color="auto" w:fill="0B3D62"/>
+            <w:tcMar>
+              <w:top w:w="70" w:type="dxa"/>
+              <w:bottom w:w="70" w:type="dxa"/>
+              <w:left w:w="80" w:type="dxa"/>
+              <w:right w:w="80" w:type="dxa"/>
+            </w:tcMar>
+          </w:tcPr>
+          <w:p>
+            <w:pPr>
+              <w:spacing w:after="40"/>
+            </w:pPr>
+            <w:r>
+              <w:rPr>
+                <w:rFonts w:ascii="Times New Roman" w:hAnsi="Times New Roman"/>
+                <w:b/>
+                <w:color w:val="FFFFFF"/>
+                <w:sz w:val="19"/>
+              </w:rPr>
+              <w:t>Patrón GoF</w:t>
+            </w:r>
+          </w:p>
+        </w:tc>
+        <w:tc>
+          <w:tcPr>
+            <w:tcW w:type="dxa" w:w="2340"/>
+            <w:shd w:val="clear" w:color="auto" w:fill="0B3D62"/>
+            <w:tcMar>
+              <w:top w:w="70" w:type="dxa"/>
+              <w:bottom w:w="70" w:type="dxa"/>
+              <w:left w:w="80" w:type="dxa"/>
+              <w:right w:w="80" w:type="dxa"/>
+            </w:tcMar>
+          </w:tcPr>
+          <w:p>
+            <w:pPr>
+              <w:spacing w:after="40"/>
+            </w:pPr>
+            <w:r>
+              <w:rPr>
+                <w:rFonts w:ascii="Times New Roman" w:hAnsi="Times New Roman"/>
+                <w:b/>
+                <w:color w:val="FFFFFF"/>
+                <w:sz w:val="19"/>
+              </w:rPr>
+              <w:t>Ruta de Archivo Fuente (.puml)</w:t>
+            </w:r>
+          </w:p>
+        </w:tc>
+        <w:tc>
+          <w:tcPr>
+            <w:tcW w:type="dxa" w:w="2340"/>
+            <w:shd w:val="clear" w:color="auto" w:fill="0B3D62"/>
+            <w:tcMar>
+              <w:top w:w="70" w:type="dxa"/>
+              <w:bottom w:w="70" w:type="dxa"/>
+              <w:left w:w="80" w:type="dxa"/>
+              <w:right w:w="80" w:type="dxa"/>
+            </w:tcMar>
+          </w:tcPr>
+          <w:p>
+            <w:pPr>
+              <w:spacing w:after="40"/>
+            </w:pPr>
+            <w:r>
+              <w:rPr>
+                <w:rFonts w:ascii="Times New Roman" w:hAnsi="Times New Roman"/>
+                <w:b/>
+                <w:color w:val="FFFFFF"/>
+                <w:sz w:val="19"/>
+              </w:rPr>
+              <w:t>Ruta de Imagen (.png)</w:t>
+            </w:r>
+          </w:p>
+        </w:tc>
+      </w:tr>
+      <w:tr>
+        <w:tc>
+          <w:tcPr>
+            <w:tcW w:type="dxa" w:w="2340"/>
+            <w:shd w:val="clear" w:color="auto" w:fill="FFFFFF"/>
+            <w:tcMar>
+              <w:top w:w="50" w:type="dxa"/>
+              <w:bottom w:w="50" w:type="dxa"/>
+              <w:left w:w="60" w:type="dxa"/>
+              <w:right w:w="60" w:type="dxa"/>
+            </w:tcMar>
+          </w:tcPr>
+          <w:p>
+            <w:pPr>
+              <w:spacing w:after="40"/>
+            </w:pPr>
+            <w:r>
+              <w:rPr>
+                <w:rFonts w:ascii="Times New Roman" w:hAnsi="Times New Roman"/>
+                <w:b/>
+                <w:color w:val="141414"/>
+                <w:sz w:val="17"/>
+              </w:rPr>
+              <w:t>Figura 1</w:t>
+            </w:r>
+          </w:p>
+        </w:tc>
+        <w:tc>
+          <w:tcPr>
+            <w:tcW w:type="dxa" w:w="2340"/>
+            <w:shd w:val="clear" w:color="auto" w:fill="FFFFFF"/>
+            <w:tcMar>
+              <w:top w:w="50" w:type="dxa"/>
+              <w:bottom w:w="50" w:type="dxa"/>
+              <w:left w:w="60" w:type="dxa"/>
+              <w:right w:w="60" w:type="dxa"/>
+            </w:tcMar>
+          </w:tcPr>
+          <w:p>
+            <w:pPr>
+              <w:spacing w:after="40"/>
+            </w:pPr>
+            <w:r>
+              <w:rPr>
+                <w:rFonts w:ascii="Times New Roman" w:hAnsi="Times New Roman"/>
+                <w:color w:val="141414"/>
+                <w:sz w:val="17"/>
+              </w:rPr>
+              <w:t>Factory Method + Adapter</w:t>
+            </w:r>
+          </w:p>
+        </w:tc>
+        <w:tc>
+          <w:tcPr>
+            <w:tcW w:type="dxa" w:w="2340"/>
+            <w:shd w:val="clear" w:color="auto" w:fill="FFFFFF"/>
+            <w:tcMar>
+              <w:top w:w="50" w:type="dxa"/>
+              <w:bottom w:w="50" w:type="dxa"/>
+              <w:left w:w="60" w:type="dxa"/>
+              <w:right w:w="60" w:type="dxa"/>
+            </w:tcMar>
+          </w:tcPr>
+          <w:p>
+            <w:pPr>
+              <w:spacing w:after="40"/>
+            </w:pPr>
+            <w:r>
+              <w:rPr>
+                <w:rFonts w:ascii="Times New Roman" w:hAnsi="Times New Roman"/>
+                <w:color w:val="141414"/>
+                <w:sz w:val="17"/>
+              </w:rPr>
+              <w:t>docs/patterns/ruta-colca/diagramas/patron-pagos-factory-adapter.puml</w:t>
+            </w:r>
+          </w:p>
+        </w:tc>
+        <w:tc>
+          <w:tcPr>
+            <w:tcW w:type="dxa" w:w="2340"/>
+            <w:shd w:val="clear" w:color="auto" w:fill="FFFFFF"/>
+            <w:tcMar>
+              <w:top w:w="50" w:type="dxa"/>
+              <w:bottom w:w="50" w:type="dxa"/>
+              <w:left w:w="60" w:type="dxa"/>
+              <w:right w:w="60" w:type="dxa"/>
+            </w:tcMar>
+          </w:tcPr>
+          <w:p>
+            <w:pPr>
+              <w:spacing w:after="40"/>
+            </w:pPr>
+            <w:r>
+              <w:rPr>
+                <w:rFonts w:ascii="Times New Roman" w:hAnsi="Times New Roman"/>
+                <w:color w:val="141414"/>
+                <w:sz w:val="17"/>
+              </w:rPr>
+              <w:t>docs/patterns/ruta-colca/diagramas/patron-pagos-factory-adapter.png</w:t>
+            </w:r>
+          </w:p>
+        </w:tc>
+      </w:tr>
+      <w:tr>
+        <w:tc>
+          <w:tcPr>
+            <w:tcW w:type="dxa" w:w="2340"/>
+            <w:shd w:val="clear" w:color="auto" w:fill="F9FAFC"/>
+            <w:tcMar>
+              <w:top w:w="50" w:type="dxa"/>
+              <w:bottom w:w="50" w:type="dxa"/>
+              <w:left w:w="60" w:type="dxa"/>
+              <w:right w:w="60" w:type="dxa"/>
+            </w:tcMar>
+          </w:tcPr>
+          <w:p>
+            <w:pPr>
+              <w:spacing w:after="40"/>
+            </w:pPr>
+            <w:r>
+              <w:rPr>
+                <w:rFonts w:ascii="Times New Roman" w:hAnsi="Times New Roman"/>
+                <w:b/>
+                <w:color w:val="141414"/>
+                <w:sz w:val="17"/>
+              </w:rPr>
+              <w:t>Figura 2</w:t>
+            </w:r>
+          </w:p>
+        </w:tc>
+        <w:tc>
+          <w:tcPr>
+            <w:tcW w:type="dxa" w:w="2340"/>
+            <w:shd w:val="clear" w:color="auto" w:fill="F9FAFC"/>
+            <w:tcMar>
+              <w:top w:w="50" w:type="dxa"/>
+              <w:bottom w:w="50" w:type="dxa"/>
+              <w:left w:w="60" w:type="dxa"/>
+              <w:right w:w="60" w:type="dxa"/>
+            </w:tcMar>
+          </w:tcPr>
+          <w:p>
+            <w:pPr>
+              <w:spacing w:after="40"/>
+            </w:pPr>
+            <w:r>
+              <w:rPr>
+                <w:rFonts w:ascii="Times New Roman" w:hAnsi="Times New Roman"/>
+                <w:color w:val="141414"/>
+                <w:sz w:val="17"/>
+              </w:rPr>
+              <w:t>Strategy</w:t>
+            </w:r>
+          </w:p>
+        </w:tc>
+        <w:tc>
+          <w:tcPr>
+            <w:tcW w:type="dxa" w:w="2340"/>
+            <w:shd w:val="clear" w:color="auto" w:fill="F9FAFC"/>
+            <w:tcMar>
+              <w:top w:w="50" w:type="dxa"/>
+              <w:bottom w:w="50" w:type="dxa"/>
+              <w:left w:w="60" w:type="dxa"/>
+              <w:right w:w="60" w:type="dxa"/>
+            </w:tcMar>
+          </w:tcPr>
+          <w:p>
+            <w:pPr>
+              <w:spacing w:after="40"/>
+            </w:pPr>
+            <w:r>
+              <w:rPr>
+                <w:rFonts w:ascii="Times New Roman" w:hAnsi="Times New Roman"/>
+                <w:color w:val="141414"/>
+                <w:sz w:val="17"/>
+              </w:rPr>
+              <w:t>docs/patterns/ruta-colca/diagramas/patron-tarifas-strategy.puml</w:t>
+            </w:r>
+          </w:p>
+        </w:tc>
+        <w:tc>
+          <w:tcPr>
+            <w:tcW w:type="dxa" w:w="2340"/>
+            <w:shd w:val="clear" w:color="auto" w:fill="F9FAFC"/>
+            <w:tcMar>
+              <w:top w:w="50" w:type="dxa"/>
+              <w:bottom w:w="50" w:type="dxa"/>
+              <w:left w:w="60" w:type="dxa"/>
+              <w:right w:w="60" w:type="dxa"/>
+            </w:tcMar>
+          </w:tcPr>
+          <w:p>
+            <w:pPr>
+              <w:spacing w:after="40"/>
+            </w:pPr>
+            <w:r>
+              <w:rPr>
+                <w:rFonts w:ascii="Times New Roman" w:hAnsi="Times New Roman"/>
+                <w:color w:val="141414"/>
+                <w:sz w:val="17"/>
+              </w:rPr>
+              <w:t>docs/patterns/ruta-colca/diagramas/patron-tarifas-strategy.png</w:t>
+            </w:r>
+          </w:p>
+        </w:tc>
+      </w:tr>
+      <w:tr>
+        <w:tc>
+          <w:tcPr>
+            <w:tcW w:type="dxa" w:w="2340"/>
+            <w:shd w:val="clear" w:color="auto" w:fill="FFFFFF"/>
+            <w:tcMar>
+              <w:top w:w="50" w:type="dxa"/>
+              <w:bottom w:w="50" w:type="dxa"/>
+              <w:left w:w="60" w:type="dxa"/>
+              <w:right w:w="60" w:type="dxa"/>
+            </w:tcMar>
+          </w:tcPr>
+          <w:p>
+            <w:pPr>
+              <w:spacing w:after="40"/>
+            </w:pPr>
+            <w:r>
+              <w:rPr>
+                <w:rFonts w:ascii="Times New Roman" w:hAnsi="Times New Roman"/>
+                <w:b/>
+                <w:color w:val="141414"/>
+                <w:sz w:val="17"/>
+              </w:rPr>
+              <w:t>Figura 3</w:t>
+            </w:r>
+          </w:p>
+        </w:tc>
+        <w:tc>
+          <w:tcPr>
+            <w:tcW w:type="dxa" w:w="2340"/>
+            <w:shd w:val="clear" w:color="auto" w:fill="FFFFFF"/>
+            <w:tcMar>
+              <w:top w:w="50" w:type="dxa"/>
+              <w:bottom w:w="50" w:type="dxa"/>
+              <w:left w:w="60" w:type="dxa"/>
+              <w:right w:w="60" w:type="dxa"/>
+            </w:tcMar>
+          </w:tcPr>
+          <w:p>
+            <w:pPr>
+              <w:spacing w:after="40"/>
+            </w:pPr>
+            <w:r>
+              <w:rPr>
+                <w:rFonts w:ascii="Times New Roman" w:hAnsi="Times New Roman"/>
+                <w:color w:val="141414"/>
+                <w:sz w:val="17"/>
+              </w:rPr>
+              <w:t>Observer</w:t>
+            </w:r>
+          </w:p>
+        </w:tc>
+        <w:tc>
+          <w:tcPr>
+            <w:tcW w:type="dxa" w:w="2340"/>
+            <w:shd w:val="clear" w:color="auto" w:fill="FFFFFF"/>
+            <w:tcMar>
+              <w:top w:w="50" w:type="dxa"/>
+              <w:bottom w:w="50" w:type="dxa"/>
+              <w:left w:w="60" w:type="dxa"/>
+              <w:right w:w="60" w:type="dxa"/>
+            </w:tcMar>
+          </w:tcPr>
+          <w:p>
+            <w:pPr>
+              <w:spacing w:after="40"/>
+            </w:pPr>
+            <w:r>
+              <w:rPr>
+                <w:rFonts w:ascii="Times New Roman" w:hAnsi="Times New Roman"/>
+                <w:color w:val="141414"/>
+                <w:sz w:val="17"/>
+              </w:rPr>
+              <w:t>docs/patterns/ruta-colca/diagramas/patron-notificaciones-observer.puml</w:t>
+            </w:r>
+          </w:p>
+        </w:tc>
+        <w:tc>
+          <w:tcPr>
+            <w:tcW w:type="dxa" w:w="2340"/>
+            <w:shd w:val="clear" w:color="auto" w:fill="FFFFFF"/>
+            <w:tcMar>
+              <w:top w:w="50" w:type="dxa"/>
+              <w:bottom w:w="50" w:type="dxa"/>
+              <w:left w:w="60" w:type="dxa"/>
+              <w:right w:w="60" w:type="dxa"/>
+            </w:tcMar>
+          </w:tcPr>
+          <w:p>
+            <w:pPr>
+              <w:spacing w:after="40"/>
+            </w:pPr>
+            <w:r>
+              <w:rPr>
+                <w:rFonts w:ascii="Times New Roman" w:hAnsi="Times New Roman"/>
+                <w:color w:val="141414"/>
+                <w:sz w:val="17"/>
+              </w:rPr>
+              <w:t>docs/patterns/ruta-colca/diagramas/patron-notificaciones-observer.png</w:t>
+            </w:r>
+          </w:p>
+        </w:tc>
+      </w:tr>
+      <w:tr>
+        <w:tc>
+          <w:tcPr>
+            <w:tcW w:type="dxa" w:w="2340"/>
+            <w:shd w:val="clear" w:color="auto" w:fill="F9FAFC"/>
+            <w:tcMar>
+              <w:top w:w="50" w:type="dxa"/>
+              <w:bottom w:w="50" w:type="dxa"/>
+              <w:left w:w="60" w:type="dxa"/>
+              <w:right w:w="60" w:type="dxa"/>
+            </w:tcMar>
+          </w:tcPr>
+          <w:p>
+            <w:pPr>
+              <w:spacing w:after="40"/>
+            </w:pPr>
+            <w:r>
+              <w:rPr>
+                <w:rFonts w:ascii="Times New Roman" w:hAnsi="Times New Roman"/>
+                <w:b/>
+                <w:color w:val="141414"/>
+                <w:sz w:val="17"/>
+              </w:rPr>
+              <w:t>Figura 4</w:t>
+            </w:r>
+          </w:p>
+        </w:tc>
+        <w:tc>
+          <w:tcPr>
+            <w:tcW w:type="dxa" w:w="2340"/>
+            <w:shd w:val="clear" w:color="auto" w:fill="F9FAFC"/>
+            <w:tcMar>
+              <w:top w:w="50" w:type="dxa"/>
+              <w:bottom w:w="50" w:type="dxa"/>
+              <w:left w:w="60" w:type="dxa"/>
+              <w:right w:w="60" w:type="dxa"/>
+            </w:tcMar>
+          </w:tcPr>
+          <w:p>
+            <w:pPr>
+              <w:spacing w:after="40"/>
+            </w:pPr>
+            <w:r>
+              <w:rPr>
+                <w:rFonts w:ascii="Times New Roman" w:hAnsi="Times New Roman"/>
+                <w:color w:val="141414"/>
+                <w:sz w:val="17"/>
+              </w:rPr>
+              <w:t>Adapter</w:t>
+            </w:r>
+          </w:p>
+        </w:tc>
+        <w:tc>
+          <w:tcPr>
+            <w:tcW w:type="dxa" w:w="2340"/>
+            <w:shd w:val="clear" w:color="auto" w:fill="F9FAFC"/>
+            <w:tcMar>
+              <w:top w:w="50" w:type="dxa"/>
+              <w:bottom w:w="50" w:type="dxa"/>
+              <w:left w:w="60" w:type="dxa"/>
+              <w:right w:w="60" w:type="dxa"/>
+            </w:tcMar>
+          </w:tcPr>
+          <w:p>
+            <w:pPr>
+              <w:spacing w:after="40"/>
+            </w:pPr>
+            <w:r>
+              <w:rPr>
+                <w:rFonts w:ascii="Times New Roman" w:hAnsi="Times New Roman"/>
+                <w:color w:val="141414"/>
+                <w:sz w:val="17"/>
+              </w:rPr>
+              <w:t>docs/patterns/ruta-colca/diagramas/patron-autocolca-adapter.puml</w:t>
+            </w:r>
+          </w:p>
+        </w:tc>
+        <w:tc>
+          <w:tcPr>
+            <w:tcW w:type="dxa" w:w="2340"/>
+            <w:shd w:val="clear" w:color="auto" w:fill="F9FAFC"/>
+            <w:tcMar>
+              <w:top w:w="50" w:type="dxa"/>
+              <w:bottom w:w="50" w:type="dxa"/>
+              <w:left w:w="60" w:type="dxa"/>
+              <w:right w:w="60" w:type="dxa"/>
+            </w:tcMar>
+          </w:tcPr>
+          <w:p>
+            <w:pPr>
+              <w:spacing w:after="40"/>
+            </w:pPr>
+            <w:r>
+              <w:rPr>
+                <w:rFonts w:ascii="Times New Roman" w:hAnsi="Times New Roman"/>
+                <w:color w:val="141414"/>
+                <w:sz w:val="17"/>
+              </w:rPr>
+              <w:t>docs/patterns/ruta-colca/diagramas/patron-autocolca-adapter.png</w:t>
+            </w:r>
+          </w:p>
+        </w:tc>
+      </w:tr>
+    </w:tbl>
+    <w:p>
+      <w:pPr>
+        <w:spacing w:after="160"/>
+      </w:pPr>
     </w:p>
     <w:p>
       <w:pPr>
@@ -2827,6 +3363,22 @@
     </w:p>
     <w:p>
       <w:pPr>
+        <w:spacing w:after="40"/>
+        <w:jc w:val="center"/>
+      </w:pPr>
+      <w:r>
+        <w:rPr>
+          <w:rFonts w:ascii="Times New Roman" w:hAnsi="Times New Roman"/>
+          <w:b/>
+          <w:color w:val="141414"/>
+          <w:sz w:val="20"/>
+        </w:rPr>
+        <w:t>Figura 1. Diagrama de Clases: Factory Method y Adaptadores para pasarelas de pago (Tarjeta, Yape, PayPal).</w:t>
+        <w:br/>
+      </w:r>
+    </w:p>
+    <w:p>
+      <w:pPr>
         <w:spacing w:after="240"/>
         <w:jc w:val="center"/>
       </w:pPr>
@@ -2835,9 +3387,22 @@
           <w:rFonts w:ascii="Times New Roman" w:hAnsi="Times New Roman"/>
           <w:i/>
           <w:color w:val="505050"/>
-          <w:sz w:val="20"/>
+          <w:sz w:val="18"/>
         </w:rPr>
-        <w:t>Figura 1. Diagrama de Clases: Factory Method y Adaptadores para pasarelas de pago (Tarjeta, Yape, PayPal).</w:t>
+        <w:t>• Archivo fuente PlantUML: docs/patterns/ruta-colca/diagramas/patron-pagos-factory-adapter.puml</w:t>
+        <w:br/>
+        <w:t>• Imagen renderizada: docs/patterns/ruta-colca/diagramas/patron-pagos-factory-adapter.png</w:t>
+        <w:br/>
+        <w:t xml:space="preserve">• Enlace remoto: </w:t>
+      </w:r>
+      <w:r>
+        <w:rPr>
+          <w:rFonts w:ascii="Times New Roman" w:hAnsi="Times New Roman"/>
+          <w:i/>
+          <w:color w:val="125AA0"/>
+          <w:sz w:val="18"/>
+        </w:rPr>
+        <w:t>https://github.com/leonardobaca7/rutaColca_C4/blob/main/docs/patterns/ruta-colca/diagramas/patron-pagos-factory-adapter.png</w:t>
       </w:r>
     </w:p>
     <w:p>
@@ -2897,6 +3462,22 @@
     </w:p>
     <w:p>
       <w:pPr>
+        <w:spacing w:after="40"/>
+        <w:jc w:val="center"/>
+      </w:pPr>
+      <w:r>
+        <w:rPr>
+          <w:rFonts w:ascii="Times New Roman" w:hAnsi="Times New Roman"/>
+          <w:b/>
+          <w:color w:val="141414"/>
+          <w:sz w:val="20"/>
+        </w:rPr>
+        <w:t>Figura 2. Diagrama de Clases: Patrón Strategy para el cálculo de tarifas dinámicas en RutaColca.</w:t>
+        <w:br/>
+      </w:r>
+    </w:p>
+    <w:p>
+      <w:pPr>
         <w:spacing w:after="240"/>
         <w:jc w:val="center"/>
       </w:pPr>
@@ -2905,9 +3486,22 @@
           <w:rFonts w:ascii="Times New Roman" w:hAnsi="Times New Roman"/>
           <w:i/>
           <w:color w:val="505050"/>
-          <w:sz w:val="20"/>
+          <w:sz w:val="18"/>
         </w:rPr>
-        <w:t>Figura 2. Diagrama de Clases: Patrón Strategy para el cálculo de tarifas dinámicas en RutaColca.</w:t>
+        <w:t>• Archivo fuente PlantUML: docs/patterns/ruta-colca/diagramas/patron-tarifas-strategy.puml</w:t>
+        <w:br/>
+        <w:t>• Imagen renderizada: docs/patterns/ruta-colca/diagramas/patron-tarifas-strategy.png</w:t>
+        <w:br/>
+        <w:t xml:space="preserve">• Enlace remoto: </w:t>
+      </w:r>
+      <w:r>
+        <w:rPr>
+          <w:rFonts w:ascii="Times New Roman" w:hAnsi="Times New Roman"/>
+          <w:i/>
+          <w:color w:val="125AA0"/>
+          <w:sz w:val="18"/>
+        </w:rPr>
+        <w:t>https://github.com/leonardobaca7/rutaColca_C4/blob/main/docs/patterns/ruta-colca/diagramas/patron-tarifas-strategy.png</w:t>
       </w:r>
     </w:p>
     <w:p>
@@ -2967,6 +3561,22 @@
     </w:p>
     <w:p>
       <w:pPr>
+        <w:spacing w:after="40"/>
+        <w:jc w:val="center"/>
+      </w:pPr>
+      <w:r>
+        <w:rPr>
+          <w:rFonts w:ascii="Times New Roman" w:hAnsi="Times New Roman"/>
+          <w:b/>
+          <w:color w:val="141414"/>
+          <w:sz w:val="20"/>
+        </w:rPr>
+        <w:t>Figura 3. Diagrama de Clases: Patrón Observer para la notificación concurrente y desacoplada a múltiples interesados.</w:t>
+        <w:br/>
+      </w:r>
+    </w:p>
+    <w:p>
+      <w:pPr>
         <w:spacing w:after="240"/>
         <w:jc w:val="center"/>
       </w:pPr>
@@ -2975,9 +3585,22 @@
           <w:rFonts w:ascii="Times New Roman" w:hAnsi="Times New Roman"/>
           <w:i/>
           <w:color w:val="505050"/>
-          <w:sz w:val="20"/>
+          <w:sz w:val="18"/>
         </w:rPr>
-        <w:t>Figura 3. Diagrama de Clases: Patrón Observer para la notificación concurrente y desacoplada a múltiples interesados.</w:t>
+        <w:t>• Archivo fuente PlantUML: docs/patterns/ruta-colca/diagramas/patron-notificaciones-observer.puml</w:t>
+        <w:br/>
+        <w:t>• Imagen renderizada: docs/patterns/ruta-colca/diagramas/patron-notificaciones-observer.png</w:t>
+        <w:br/>
+        <w:t xml:space="preserve">• Enlace remoto: </w:t>
+      </w:r>
+      <w:r>
+        <w:rPr>
+          <w:rFonts w:ascii="Times New Roman" w:hAnsi="Times New Roman"/>
+          <w:i/>
+          <w:color w:val="125AA0"/>
+          <w:sz w:val="18"/>
+        </w:rPr>
+        <w:t>https://github.com/leonardobaca7/rutaColca_C4/blob/main/docs/patterns/ruta-colca/diagramas/patron-notificaciones-observer.png</w:t>
       </w:r>
     </w:p>
     <w:p>
@@ -3037,6 +3660,22 @@
     </w:p>
     <w:p>
       <w:pPr>
+        <w:spacing w:after="40"/>
+        <w:jc w:val="center"/>
+      </w:pPr>
+      <w:r>
+        <w:rPr>
+          <w:rFonts w:ascii="Times New Roman" w:hAnsi="Times New Roman"/>
+          <w:b/>
+          <w:color w:val="141414"/>
+          <w:sz w:val="20"/>
+        </w:rPr>
+        <w:t>Figura 4. Diagrama de Clases: Patrón Adapter como Capa Anticorrupción frente al servicio externo de AUTOCOLCA.</w:t>
+        <w:br/>
+      </w:r>
+    </w:p>
+    <w:p>
+      <w:pPr>
         <w:spacing w:after="240"/>
         <w:jc w:val="center"/>
       </w:pPr>
@@ -3045,9 +3684,22 @@
           <w:rFonts w:ascii="Times New Roman" w:hAnsi="Times New Roman"/>
           <w:i/>
           <w:color w:val="505050"/>
-          <w:sz w:val="20"/>
+          <w:sz w:val="18"/>
         </w:rPr>
-        <w:t>Figura 4. Diagrama de Clases: Patrón Adapter como Capa Anticorrupción frente al servicio externo de AUTOCOLCA.</w:t>
+        <w:t>• Archivo fuente PlantUML: docs/patterns/ruta-colca/diagramas/patron-autocolca-adapter.puml</w:t>
+        <w:br/>
+        <w:t>• Imagen renderizada: docs/patterns/ruta-colca/diagramas/patron-autocolca-adapter.png</w:t>
+        <w:br/>
+        <w:t xml:space="preserve">• Enlace remoto: </w:t>
+      </w:r>
+      <w:r>
+        <w:rPr>
+          <w:rFonts w:ascii="Times New Roman" w:hAnsi="Times New Roman"/>
+          <w:i/>
+          <w:color w:val="125AA0"/>
+          <w:sz w:val="18"/>
+        </w:rPr>
+        <w:t>https://github.com/leonardobaca7/rutaColca_C4/blob/main/docs/patterns/ruta-colca/diagramas/patron-autocolca-adapter.png</w:t>
       </w:r>
     </w:p>
     <w:p>
@@ -3898,7 +4550,7 @@
           <w:color w:val="141414"/>
           <w:sz w:val="24"/>
         </w:rPr>
-        <w:t>El código correspondiente a los 4 patrones seleccionados fue implementado en Java 21 en el paquete `com.rutacolca.patterns`. La clase `DemoRutaColcaPatrones.java` integra y ejecuta la suite completa sin requerir dependencias externas. A continuación se presenta la captura de la salida por consola obtenida al compilar y ejecutar con JDK 22:</w:t>
+        <w:t>El código correspondiente a los 4 patrones seleccionados fue implementado en Java 21 en el paquete `com.rutacolca.patterns`. Las clases se encuentran organizadas en la carpeta `docs/patterns/ruta-colca/src/` del repositorio. La clase `DemoRutaColcaPatrones.java` integra y ejecuta la suite completa sin requerir dependencias externas. A continuación se presenta la captura de la salida por consola obtenida al compilar y ejecutar con JDK 22:</w:t>
       </w:r>
     </w:p>
     <w:tbl>

</xml_diff>